<commit_message>
Refactor project structure and streamline UI flows
</commit_message>
<xml_diff>
--- a/ARTEFATOS_MPLS/ANEXOS_TR_MPLS_TRT10.docx
+++ b/ARTEFATOS_MPLS/ANEXOS_TR_MPLS_TRT10.docx
@@ -93,7 +93,7 @@
         <w:pStyle w:val="ListBullet"/>
       </w:pPr>
       <w:r>
-        <w:t>a Sede possui 3 saidas redundantes de Internet;</w:t>
+        <w:t>a infraestrutura de Internet/borda da Sede e mantida por contratos existentes/correlatos e nao integra o objeto desta contratacao;</w:t>
       </w:r>
     </w:p>
     <w:p>
@@ -177,7 +177,7 @@
       <w:r>
         <w:drawing>
           <wp:inline xmlns:a="http://schemas.openxmlformats.org/drawingml/2006/main" xmlns:pic="http://schemas.openxmlformats.org/drawingml/2006/picture">
-            <wp:extent cx="5669280" cy="6529796"/>
+            <wp:extent cx="5669280" cy="4123113"/>
             <wp:docPr id="1" name="Picture 1"/>
             <wp:cNvGraphicFramePr>
               <a:graphicFrameLocks noChangeAspect="1"/>
@@ -198,7 +198,7 @@
                   <pic:spPr>
                     <a:xfrm>
                       <a:off x="0" y="0"/>
-                      <a:ext cx="5669280" cy="6529796"/>
+                      <a:ext cx="5669280" cy="4123113"/>
                     </a:xfrm>
                     <a:prstGeom prst="rect"/>
                   </pic:spPr>
@@ -570,7 +570,7 @@
                 <w:rFonts w:ascii="Calibri" w:hAnsi="Calibri"/>
                 <w:sz w:val="18"/>
               </w:rPr>
-              <w:t>Saidas de Internet da Sede</w:t>
+              <w:t>Infraestrutura de Internet da Sede</w:t>
             </w:r>
           </w:p>
         </w:tc>
@@ -594,7 +594,7 @@
                 <w:rFonts w:ascii="Calibri" w:hAnsi="Calibri"/>
                 <w:sz w:val="18"/>
               </w:rPr>
-              <w:t>Egressao preferencial centralizada, seguranca, filtragem e observabilidade</w:t>
+              <w:t>Egressao, seguranca, filtragem e observabilidade por contratos existentes/correlatos</w:t>
             </w:r>
           </w:p>
         </w:tc>
@@ -618,7 +618,7 @@
                 <w:rFonts w:ascii="Calibri" w:hAnsi="Calibri"/>
                 <w:sz w:val="18"/>
               </w:rPr>
-              <w:t>Continuidade de acesso para unidades em contingencia</w:t>
+              <w:t>Interoperabilidade com MPLS e SD-WAN</w:t>
             </w:r>
           </w:p>
         </w:tc>
@@ -642,7 +642,7 @@
                 <w:rFonts w:ascii="Calibri" w:hAnsi="Calibri"/>
                 <w:sz w:val="18"/>
               </w:rPr>
-              <w:t>Considera 3 saidas redundantes na Sede</w:t>
+              <w:t>Fora do escopo desta contratacao</w:t>
             </w:r>
           </w:p>
         </w:tc>

</xml_diff>